<commit_message>
Implement acta generation feature with API endpoint and frontend integration
</commit_message>
<xml_diff>
--- a/templates/docx/plantilla_acta.docx
+++ b/templates/docx/plantilla_acta.docx
@@ -372,7 +372,7 @@
                 <w:rFonts w:ascii="Arial" w:eastAsia="Arial" w:hAnsi="Arial" w:cs="Arial"/>
                 <w:color w:val="000000" w:themeColor="text1"/>
               </w:rPr>
-              <w:t xml:space="preserve">INV-{{nro_inventario}}</w:t>
+              <w:t>{{nro_inventario}}</w:t>
             </w:r>
           </w:p>
         </w:tc>
@@ -609,7 +609,7 @@
                 <w:rFonts w:ascii="Arial" w:eastAsia="Arial" w:hAnsi="Arial" w:cs="Arial"/>
                 <w:color w:val="000000" w:themeColor="text1"/>
               </w:rPr>
-              <w:t xml:space="preserve">INV-{{nro_inventario}}</w:t>
+              <w:t>{{nro_inventario}}</w:t>
             </w:r>
           </w:p>
         </w:tc>

</xml_diff>

<commit_message>
Enhance acta generation: add PDF conversion, validate inventory numbers, and improve UI
</commit_message>
<xml_diff>
--- a/templates/docx/plantilla_acta.docx
+++ b/templates/docx/plantilla_acta.docx
@@ -118,14 +118,7 @@
         </w:rPr>
         <w:t xml:space="preserve"> {{tipo_texto}} </w:t>
       </w:r>
-      <w:r>
-        <w:rPr>
-          <w:rFonts w:ascii="Arial" w:eastAsia="Arial" w:hAnsi="Arial" w:cs="Arial"/>
-          <w:color w:val="000000" w:themeColor="text1"/>
-          <w:lang w:val="es-AR"/>
-        </w:rPr>
-        <w:t xml:space="preserve"> </w:t>
-      </w:r>
+      <w:proofErr w:type="gramStart"/>
       <w:r>
         <w:rPr>
           <w:rFonts w:ascii="Arial" w:eastAsia="Arial" w:hAnsi="Arial" w:cs="Arial"/>
@@ -140,7 +133,16 @@
           <w:color w:val="000000" w:themeColor="text1"/>
           <w:lang w:val="es-AR"/>
         </w:rPr>
-        <w:t>de los elementos detallados en la tabla a continuación</w:t>
+        <w:t xml:space="preserve"> de</w:t>
+      </w:r>
+      <w:proofErr w:type="gramEnd"/>
+      <w:r>
+        <w:rPr>
+          <w:rFonts w:ascii="Arial" w:eastAsia="Arial" w:hAnsi="Arial" w:cs="Arial"/>
+          <w:color w:val="000000" w:themeColor="text1"/>
+          <w:lang w:val="es-AR"/>
+        </w:rPr>
+        <w:t xml:space="preserve"> los elementos detallados en la tabla a continuación</w:t>
       </w:r>
       <w:r>
         <w:rPr>
@@ -166,7 +168,67 @@
           <w:color w:val="000000" w:themeColor="text1"/>
           <w:lang w:val="es-AR"/>
         </w:rPr>
-        <w:t xml:space="preserve">Cuya utilización le es cedida de manera exclusiva para las actividades que corresponden al objeto de la {{area_departamento}}, comprometiéndose a dar aviso ante los eventuales incidentes que puedan surgir por el buen uso de los bienes.</w:t>
+        <w:t xml:space="preserve">Cuya utilización le es cedida de manera exclusiva para las actividades que corresponden al objeto </w:t>
+      </w:r>
+      <w:proofErr w:type="gramStart"/>
+      <w:r>
+        <w:rPr>
+          <w:rFonts w:ascii="Arial" w:eastAsia="Arial" w:hAnsi="Arial" w:cs="Arial"/>
+          <w:color w:val="000000" w:themeColor="text1"/>
+          <w:lang w:val="es-AR"/>
+        </w:rPr>
+        <w:t>de</w:t>
+      </w:r>
+      <w:r>
+        <w:rPr>
+          <w:rFonts w:ascii="Arial" w:eastAsia="Arial" w:hAnsi="Arial" w:cs="Arial"/>
+          <w:color w:val="000000" w:themeColor="text1"/>
+          <w:lang w:val="es-AR"/>
+        </w:rPr>
+        <w:t xml:space="preserve"> </w:t>
+      </w:r>
+      <w:r>
+        <w:rPr>
+          <w:rFonts w:ascii="Arial" w:eastAsia="Arial" w:hAnsi="Arial" w:cs="Arial"/>
+          <w:color w:val="000000" w:themeColor="text1"/>
+          <w:lang w:val="es-AR"/>
+        </w:rPr>
+        <w:t xml:space="preserve"> </w:t>
+      </w:r>
+      <w:r>
+        <w:rPr>
+          <w:rFonts w:ascii="Arial" w:eastAsia="Arial" w:hAnsi="Arial" w:cs="Arial"/>
+          <w:color w:val="000000" w:themeColor="text1"/>
+          <w:lang w:val="es-AR"/>
+        </w:rPr>
+        <w:t>{{area_departamento}}</w:t>
+      </w:r>
+      <w:proofErr w:type="gramEnd"/>
+      <w:r>
+        <w:rPr>
+          <w:rFonts w:ascii="Arial" w:eastAsia="Arial" w:hAnsi="Arial" w:cs="Arial"/>
+          <w:color w:val="000000" w:themeColor="text1"/>
+          <w:lang w:val="es-AR"/>
+        </w:rPr>
+        <w:t/>
+      </w:r>
+      <w:proofErr w:type="spellStart"/>
+      <w:r>
+        <w:rPr>
+          <w:rFonts w:ascii="Arial" w:eastAsia="Arial" w:hAnsi="Arial" w:cs="Arial"/>
+          <w:color w:val="000000" w:themeColor="text1"/>
+          <w:lang w:val="es-AR"/>
+        </w:rPr>
+        <w:t/>
+      </w:r>
+      <w:proofErr w:type="spellEnd"/>
+      <w:r>
+        <w:rPr>
+          <w:rFonts w:ascii="Arial" w:eastAsia="Arial" w:hAnsi="Arial" w:cs="Arial"/>
+          <w:color w:val="000000" w:themeColor="text1"/>
+          <w:lang w:val="es-AR"/>
+        </w:rPr>
+        <w:t>, comprometiéndose a dar aviso ante los eventuales incidentes que puedan surgir por el buen uso de los bienes.</w:t>
       </w:r>
     </w:p>
     <w:p>

</xml_diff>

<commit_message>
Add theme toggle functionality and enhance UI: implement dark mode support, update area/department selection, and improve styling
</commit_message>
<xml_diff>
--- a/templates/docx/plantilla_acta.docx
+++ b/templates/docx/plantilla_acta.docx
@@ -264,9 +264,10 @@
         <w:tblLook w:val="06A0" w:firstRow="1" w:lastRow="0" w:firstColumn="1" w:lastColumn="0" w:noHBand="1" w:noVBand="1"/>
       </w:tblPr>
       <w:tblGrid>
-        <w:gridCol w:w="4305"/>
-        <w:gridCol w:w="3238"/>
-        <w:gridCol w:w="1602"/>
+        <w:gridCol w:w="3300"/>
+        <w:gridCol w:w="2200"/>
+        <w:gridCol w:w="1600"/>
+        <w:gridCol w:w="2045"/>
       </w:tblGrid>
       <w:tr>
         <w:trPr>
@@ -274,7 +275,7 @@
         </w:trPr>
         <w:tc>
           <w:tcPr>
-            <w:tcW w:w="4305" w:type="dxa"/>
+            <w:tcW w:w="3300" w:type="dxa"/>
             <w:tcBorders>
               <w:top w:val="single" w:sz="6" w:space="0" w:color="auto"/>
               <w:left w:val="single" w:sz="6" w:space="0" w:color="auto"/>
@@ -307,7 +308,7 @@
         </w:tc>
         <w:tc>
           <w:tcPr>
-            <w:tcW w:w="3238" w:type="dxa"/>
+            <w:tcW w:w="2200" w:type="dxa"/>
             <w:tcBorders>
               <w:top w:val="single" w:sz="6" w:space="0" w:color="auto"/>
               <w:right w:val="single" w:sz="6" w:space="0" w:color="auto"/>
@@ -341,7 +342,7 @@
         </w:tc>
         <w:tc>
           <w:tcPr>
-            <w:tcW w:w="1602" w:type="dxa"/>
+            <w:tcW w:w="1600" w:type="dxa"/>
             <w:tcBorders>
               <w:top w:val="single" w:sz="6" w:space="0" w:color="auto"/>
               <w:right w:val="single" w:sz="6" w:space="0" w:color="auto"/>
@@ -368,6 +369,40 @@
                 <w:lang w:val="es-AR"/>
               </w:rPr>
               <w:t>Cantidad</w:t>
+            </w:r>
+          </w:p>
+        </w:tc>
+        <w:tc>
+          <w:tcPr>
+            <w:tcW w:w="2045" w:type="dxa"/>
+            <w:tcBorders>
+              <w:top w:val="single" w:sz="6" w:space="0" w:color="auto"/>
+              <w:right w:val="single" w:sz="6" w:space="0" w:color="auto"/>
+            </w:tcBorders>
+            <w:tcMar>
+              <w:left w:w="90" w:type="dxa"/>
+              <w:right w:w="90" w:type="dxa"/>
+            </w:tcMar>
+          </w:tcPr>
+          <w:p>
+            <w:pPr>
+              <w:spacing w:line="259" w:lineRule="auto"/>
+              <w:jc w:val="center"/>
+              <w:rPr>
+                <w:rFonts w:ascii="Arial" w:eastAsia="Arial" w:hAnsi="Arial" w:cs="Arial"/>
+                <w:b/>
+                <w:bCs/>
+                <w:color w:val="000000" w:themeColor="text1"/>
+              </w:rPr>
+            </w:pPr>
+            <w:r>
+              <w:rPr>
+                <w:rFonts w:ascii="Arial" w:eastAsia="Arial" w:hAnsi="Arial" w:cs="Arial"/>
+                <w:b/>
+                <w:bCs/>
+                <w:color w:val="000000" w:themeColor="text1"/>
+              </w:rPr>
+              <w:t>Observación</w:t>
             </w:r>
           </w:p>
         </w:tc>
@@ -378,7 +413,7 @@
         </w:trPr>
         <w:tc>
           <w:tcPr>
-            <w:tcW w:w="4305" w:type="dxa"/>
+            <w:tcW w:w="3300" w:type="dxa"/>
             <w:tcBorders>
               <w:left w:val="single" w:sz="6" w:space="0" w:color="auto"/>
               <w:bottom w:val="single" w:sz="6" w:space="0" w:color="auto"/>
@@ -410,7 +445,7 @@
         </w:tc>
         <w:tc>
           <w:tcPr>
-            <w:tcW w:w="3238" w:type="dxa"/>
+            <w:tcW w:w="2200" w:type="dxa"/>
             <w:tcBorders>
               <w:bottom w:val="single" w:sz="6" w:space="0" w:color="auto"/>
               <w:right w:val="single" w:sz="6" w:space="0" w:color="auto"/>
@@ -440,7 +475,7 @@
         </w:tc>
         <w:tc>
           <w:tcPr>
-            <w:tcW w:w="1602" w:type="dxa"/>
+            <w:tcW w:w="1600" w:type="dxa"/>
             <w:tcBorders>
               <w:bottom w:val="single" w:sz="6" w:space="0" w:color="auto"/>
               <w:right w:val="single" w:sz="6" w:space="0" w:color="auto"/>
@@ -461,6 +496,36 @@
                 <w:color w:val="000000" w:themeColor="text1"/>
               </w:rPr>
               <w:t>{{cantidad}}</w:t>
+            </w:r>
+          </w:p>
+        </w:tc>
+        <w:tc>
+          <w:tcPr>
+            <w:tcW w:w="2045" w:type="dxa"/>
+            <w:tcBorders>
+              <w:bottom w:val="single" w:sz="6" w:space="0" w:color="auto"/>
+              <w:right w:val="single" w:sz="6" w:space="0" w:color="auto"/>
+            </w:tcBorders>
+            <w:tcMar>
+              <w:left w:w="90" w:type="dxa"/>
+              <w:right w:w="90" w:type="dxa"/>
+            </w:tcMar>
+          </w:tcPr>
+          <w:p>
+            <w:pPr>
+              <w:spacing w:line="259" w:lineRule="auto"/>
+              <w:jc w:val="center"/>
+              <w:rPr>
+                <w:rFonts w:ascii="Arial" w:eastAsia="Arial" w:hAnsi="Arial" w:cs="Arial"/>
+                <w:color w:val="000000" w:themeColor="text1"/>
+              </w:rPr>
+            </w:pPr>
+            <w:r>
+              <w:rPr>
+                <w:rFonts w:ascii="Arial" w:eastAsia="Arial" w:hAnsi="Arial" w:cs="Arial"/>
+                <w:color w:val="000000" w:themeColor="text1"/>
+              </w:rPr>
+              <w:t>{{observacion}}</w:t>
             </w:r>
           </w:p>
         </w:tc>
@@ -501,9 +566,10 @@
         <w:tblLook w:val="06A0" w:firstRow="1" w:lastRow="0" w:firstColumn="1" w:lastColumn="0" w:noHBand="1" w:noVBand="1"/>
       </w:tblPr>
       <w:tblGrid>
-        <w:gridCol w:w="4305"/>
-        <w:gridCol w:w="3238"/>
-        <w:gridCol w:w="1602"/>
+        <w:gridCol w:w="3300"/>
+        <w:gridCol w:w="2200"/>
+        <w:gridCol w:w="1600"/>
+        <w:gridCol w:w="2045"/>
       </w:tblGrid>
       <w:tr>
         <w:trPr>
@@ -511,7 +577,7 @@
         </w:trPr>
         <w:tc>
           <w:tcPr>
-            <w:tcW w:w="4305" w:type="dxa"/>
+            <w:tcW w:w="3300" w:type="dxa"/>
             <w:tcBorders>
               <w:top w:val="single" w:sz="6" w:space="0" w:color="auto"/>
               <w:left w:val="single" w:sz="6" w:space="0" w:color="auto"/>
@@ -544,7 +610,7 @@
         </w:tc>
         <w:tc>
           <w:tcPr>
-            <w:tcW w:w="3238" w:type="dxa"/>
+            <w:tcW w:w="2200" w:type="dxa"/>
             <w:tcBorders>
               <w:top w:val="single" w:sz="6" w:space="0" w:color="auto"/>
               <w:right w:val="single" w:sz="6" w:space="0" w:color="auto"/>
@@ -578,7 +644,7 @@
         </w:tc>
         <w:tc>
           <w:tcPr>
-            <w:tcW w:w="1602" w:type="dxa"/>
+            <w:tcW w:w="1600" w:type="dxa"/>
             <w:tcBorders>
               <w:top w:val="single" w:sz="6" w:space="0" w:color="auto"/>
               <w:right w:val="single" w:sz="6" w:space="0" w:color="auto"/>
@@ -605,6 +671,40 @@
                 <w:lang w:val="es-AR"/>
               </w:rPr>
               <w:t>Cantidad</w:t>
+            </w:r>
+          </w:p>
+        </w:tc>
+        <w:tc>
+          <w:tcPr>
+            <w:tcW w:w="2045" w:type="dxa"/>
+            <w:tcBorders>
+              <w:top w:val="single" w:sz="6" w:space="0" w:color="auto"/>
+              <w:right w:val="single" w:sz="6" w:space="0" w:color="auto"/>
+            </w:tcBorders>
+            <w:tcMar>
+              <w:left w:w="90" w:type="dxa"/>
+              <w:right w:w="90" w:type="dxa"/>
+            </w:tcMar>
+          </w:tcPr>
+          <w:p>
+            <w:pPr>
+              <w:spacing w:line="259" w:lineRule="auto"/>
+              <w:jc w:val="center"/>
+              <w:rPr>
+                <w:rFonts w:ascii="Arial" w:eastAsia="Arial" w:hAnsi="Arial" w:cs="Arial"/>
+                <w:b/>
+                <w:bCs/>
+                <w:color w:val="000000" w:themeColor="text1"/>
+              </w:rPr>
+            </w:pPr>
+            <w:r>
+              <w:rPr>
+                <w:rFonts w:ascii="Arial" w:eastAsia="Arial" w:hAnsi="Arial" w:cs="Arial"/>
+                <w:b/>
+                <w:bCs/>
+                <w:color w:val="000000" w:themeColor="text1"/>
+              </w:rPr>
+              <w:t>Observación</w:t>
             </w:r>
           </w:p>
         </w:tc>
@@ -615,7 +715,7 @@
         </w:trPr>
         <w:tc>
           <w:tcPr>
-            <w:tcW w:w="4305" w:type="dxa"/>
+            <w:tcW w:w="3300" w:type="dxa"/>
             <w:tcBorders>
               <w:left w:val="single" w:sz="6" w:space="0" w:color="auto"/>
               <w:bottom w:val="single" w:sz="6" w:space="0" w:color="auto"/>
@@ -647,7 +747,7 @@
         </w:tc>
         <w:tc>
           <w:tcPr>
-            <w:tcW w:w="3238" w:type="dxa"/>
+            <w:tcW w:w="2200" w:type="dxa"/>
             <w:tcBorders>
               <w:bottom w:val="single" w:sz="6" w:space="0" w:color="auto"/>
               <w:right w:val="single" w:sz="6" w:space="0" w:color="auto"/>
@@ -677,7 +777,7 @@
         </w:tc>
         <w:tc>
           <w:tcPr>
-            <w:tcW w:w="1602" w:type="dxa"/>
+            <w:tcW w:w="1600" w:type="dxa"/>
             <w:tcBorders>
               <w:bottom w:val="single" w:sz="6" w:space="0" w:color="auto"/>
               <w:right w:val="single" w:sz="6" w:space="0" w:color="auto"/>
@@ -698,6 +798,36 @@
                 <w:color w:val="000000" w:themeColor="text1"/>
               </w:rPr>
               <w:t>{{cantidad}}</w:t>
+            </w:r>
+          </w:p>
+        </w:tc>
+        <w:tc>
+          <w:tcPr>
+            <w:tcW w:w="2045" w:type="dxa"/>
+            <w:tcBorders>
+              <w:bottom w:val="single" w:sz="6" w:space="0" w:color="auto"/>
+              <w:right w:val="single" w:sz="6" w:space="0" w:color="auto"/>
+            </w:tcBorders>
+            <w:tcMar>
+              <w:left w:w="90" w:type="dxa"/>
+              <w:right w:w="90" w:type="dxa"/>
+            </w:tcMar>
+          </w:tcPr>
+          <w:p>
+            <w:pPr>
+              <w:spacing w:line="259" w:lineRule="auto"/>
+              <w:jc w:val="center"/>
+              <w:rPr>
+                <w:rFonts w:ascii="Arial" w:eastAsia="Arial" w:hAnsi="Arial" w:cs="Arial"/>
+                <w:color w:val="000000" w:themeColor="text1"/>
+              </w:rPr>
+            </w:pPr>
+            <w:r>
+              <w:rPr>
+                <w:rFonts w:ascii="Arial" w:eastAsia="Arial" w:hAnsi="Arial" w:cs="Arial"/>
+                <w:color w:val="000000" w:themeColor="text1"/>
+              </w:rPr>
+              <w:t>{{observacion}}</w:t>
             </w:r>
           </w:p>
         </w:tc>

</xml_diff>

<commit_message>
Enhance input validation and UI: limit inventory number input to 8 digits, update area/department options, and improve styling for autofill support
</commit_message>
<xml_diff>
--- a/templates/docx/plantilla_acta.docx
+++ b/templates/docx/plantilla_acta.docx
@@ -116,7 +116,7 @@
           <w:color w:val="000000" w:themeColor="text1"/>
           <w:lang w:val="es-AR"/>
         </w:rPr>
-        <w:t xml:space="preserve"> {{tipo_texto}} </w:t>
+        <w:t xml:space="preserve"> {{tipo_texto}}</w:t>
       </w:r>
       <w:proofErr w:type="gramStart"/>
       <w:r>
@@ -125,7 +125,7 @@
           <w:color w:val="000000" w:themeColor="text1"/>
           <w:lang w:val="es-AR"/>
         </w:rPr>
-        <w:t xml:space="preserve"/>
+        <w:t xml:space="preserve"> </w:t>
       </w:r>
       <w:r>
         <w:rPr>
@@ -201,7 +201,7 @@
           <w:color w:val="000000" w:themeColor="text1"/>
           <w:lang w:val="es-AR"/>
         </w:rPr>
-        <w:t>{{area_departamento}}</w:t>
+        <w:t/>
       </w:r>
       <w:proofErr w:type="gramEnd"/>
       <w:r>
@@ -210,25 +210,7 @@
           <w:color w:val="000000" w:themeColor="text1"/>
           <w:lang w:val="es-AR"/>
         </w:rPr>
-        <w:t/>
-      </w:r>
-      <w:proofErr w:type="spellStart"/>
-      <w:r>
-        <w:rPr>
-          <w:rFonts w:ascii="Arial" w:eastAsia="Arial" w:hAnsi="Arial" w:cs="Arial"/>
-          <w:color w:val="000000" w:themeColor="text1"/>
-          <w:lang w:val="es-AR"/>
-        </w:rPr>
-        <w:t/>
-      </w:r>
-      <w:proofErr w:type="spellEnd"/>
-      <w:r>
-        <w:rPr>
-          <w:rFonts w:ascii="Arial" w:eastAsia="Arial" w:hAnsi="Arial" w:cs="Arial"/>
-          <w:color w:val="000000" w:themeColor="text1"/>
-          <w:lang w:val="es-AR"/>
-        </w:rPr>
-        <w:t>, comprometiéndose a dar aviso ante los eventuales incidentes que puedan surgir por el buen uso de los bienes.</w:t>
+        <w:t>{{area_departamento}}, comprometiéndose a dar aviso ante los eventuales incidentes que puedan surgir por el buen uso de los bienes.</w:t>
       </w:r>
     </w:p>
     <w:p>
@@ -1005,8 +987,12 @@
       </w:r>
     </w:p>
     <w:sectPr>
-      <w:headerReference w:type="default" r:id="rId6"/>
-      <w:footerReference w:type="default" r:id="rId7"/>
+      <w:headerReference w:type="even" r:id="rId6"/>
+      <w:headerReference w:type="default" r:id="rId7"/>
+      <w:footerReference w:type="even" r:id="rId8"/>
+      <w:footerReference w:type="default" r:id="rId9"/>
+      <w:headerReference w:type="first" r:id="rId10"/>
+      <w:footerReference w:type="first" r:id="rId11"/>
       <w:pgSz w:w="11906" w:h="16838"/>
       <w:pgMar w:top="0" w:right="1440" w:bottom="1440" w:left="1440" w:header="720" w:footer="720" w:gutter="0"/>
       <w:cols w:space="720"/>
@@ -1042,6 +1028,16 @@
 </file>
 
 <file path=word/footer1.xml><?xml version="1.0" encoding="utf-8"?>
+<w:ftr xmlns:wpc="http://schemas.microsoft.com/office/word/2010/wordprocessingCanvas" xmlns:cx="http://schemas.microsoft.com/office/drawing/2014/chartex" xmlns:cx1="http://schemas.microsoft.com/office/drawing/2015/9/8/chartex" xmlns:cx2="http://schemas.microsoft.com/office/drawing/2015/10/21/chartex" xmlns:cx3="http://schemas.microsoft.com/office/drawing/2016/5/9/chartex" xmlns:cx4="http://schemas.microsoft.com/office/drawing/2016/5/10/chartex" xmlns:cx5="http://schemas.microsoft.com/office/drawing/2016/5/11/chartex" xmlns:cx6="http://schemas.microsoft.com/office/drawing/2016/5/12/chartex" xmlns:cx7="http://schemas.microsoft.com/office/drawing/2016/5/13/chartex" xmlns:cx8="http://schemas.microsoft.com/office/drawing/2016/5/14/chartex" xmlns:mc="http://schemas.openxmlformats.org/markup-compatibility/2006" xmlns:aink="http://schemas.microsoft.com/office/drawing/2016/ink" xmlns:am3d="http://schemas.microsoft.com/office/drawing/2017/model3d" xmlns:o="urn:schemas-microsoft-com:office:office" xmlns:oel="http://schemas.microsoft.com/office/2019/extlst" xmlns:r="http://schemas.openxmlformats.org/officeDocument/2006/relationships" xmlns:m="http://schemas.openxmlformats.org/officeDocument/2006/math" xmlns:v="urn:schemas-microsoft-com:vml" xmlns:wp14="http://schemas.microsoft.com/office/word/2010/wordprocessingDrawing" xmlns:wp="http://schemas.openxmlformats.org/drawingml/2006/wordprocessingDrawing" xmlns:w10="urn:schemas-microsoft-com:office:word" xmlns:w="http://schemas.openxmlformats.org/wordprocessingml/2006/main" xmlns:w14="http://schemas.microsoft.com/office/word/2010/wordml" xmlns:w15="http://schemas.microsoft.com/office/word/2012/wordml" xmlns:w16cex="http://schemas.microsoft.com/office/word/2018/wordml/cex" xmlns:w16cid="http://schemas.microsoft.com/office/word/2016/wordml/cid" xmlns:w16="http://schemas.microsoft.com/office/word/2018/wordml" xmlns:w16du="http://schemas.microsoft.com/office/word/2023/wordml/word16du" xmlns:w16sdtdh="http://schemas.microsoft.com/office/word/2020/wordml/sdtdatahash" xmlns:w16sdtfl="http://schemas.microsoft.com/office/word/2024/wordml/sdtformatlock" xmlns:w16se="http://schemas.microsoft.com/office/word/2015/wordml/symex" xmlns:wpg="http://schemas.microsoft.com/office/word/2010/wordprocessingGroup" xmlns:wpi="http://schemas.microsoft.com/office/word/2010/wordprocessingInk" xmlns:wne="http://schemas.microsoft.com/office/word/2006/wordml" xmlns:wps="http://schemas.microsoft.com/office/word/2010/wordprocessingShape" mc:Ignorable="w14 w15 w16se w16cid w16 w16cex w16sdtdh w16sdtfl w16du wp14">
+  <w:p>
+    <w:pPr>
+      <w:pStyle w:val="Piedepgina"/>
+    </w:pPr>
+  </w:p>
+</w:ftr>
+</file>
+
+<file path=word/footer2.xml><?xml version="1.0" encoding="utf-8"?>
 <w:ftr xmlns:wpc="http://schemas.microsoft.com/office/word/2010/wordprocessingCanvas" xmlns:cx="http://schemas.microsoft.com/office/drawing/2014/chartex" xmlns:cx1="http://schemas.microsoft.com/office/drawing/2015/9/8/chartex" xmlns:cx2="http://schemas.microsoft.com/office/drawing/2015/10/21/chartex" xmlns:cx3="http://schemas.microsoft.com/office/drawing/2016/5/9/chartex" xmlns:cx4="http://schemas.microsoft.com/office/drawing/2016/5/10/chartex" xmlns:cx5="http://schemas.microsoft.com/office/drawing/2016/5/11/chartex" xmlns:cx6="http://schemas.microsoft.com/office/drawing/2016/5/12/chartex" xmlns:cx7="http://schemas.microsoft.com/office/drawing/2016/5/13/chartex" xmlns:cx8="http://schemas.microsoft.com/office/drawing/2016/5/14/chartex" xmlns:mc="http://schemas.openxmlformats.org/markup-compatibility/2006" xmlns:aink="http://schemas.microsoft.com/office/drawing/2016/ink" xmlns:am3d="http://schemas.microsoft.com/office/drawing/2017/model3d" xmlns:o="urn:schemas-microsoft-com:office:office" xmlns:oel="http://schemas.microsoft.com/office/2019/extlst" xmlns:r="http://schemas.openxmlformats.org/officeDocument/2006/relationships" xmlns:m="http://schemas.openxmlformats.org/officeDocument/2006/math" xmlns:v="urn:schemas-microsoft-com:vml" xmlns:wp14="http://schemas.microsoft.com/office/word/2010/wordprocessingDrawing" xmlns:wp="http://schemas.openxmlformats.org/drawingml/2006/wordprocessingDrawing" xmlns:w10="urn:schemas-microsoft-com:office:word" xmlns:w="http://schemas.openxmlformats.org/wordprocessingml/2006/main" xmlns:w14="http://schemas.microsoft.com/office/word/2010/wordml" xmlns:w15="http://schemas.microsoft.com/office/word/2012/wordml" xmlns:w16cex="http://schemas.microsoft.com/office/word/2018/wordml/cex" xmlns:w16cid="http://schemas.microsoft.com/office/word/2016/wordml/cid" xmlns:w16="http://schemas.microsoft.com/office/word/2018/wordml" xmlns:w16du="http://schemas.microsoft.com/office/word/2023/wordml/word16du" xmlns:w16sdtdh="http://schemas.microsoft.com/office/word/2020/wordml/sdtdatahash" xmlns:w16sdtfl="http://schemas.microsoft.com/office/word/2024/wordml/sdtformatlock" xmlns:w16se="http://schemas.microsoft.com/office/word/2015/wordml/symex" xmlns:wpg="http://schemas.microsoft.com/office/word/2010/wordprocessingGroup" xmlns:wpi="http://schemas.microsoft.com/office/word/2010/wordprocessingInk" xmlns:wne="http://schemas.microsoft.com/office/word/2006/wordml" xmlns:wps="http://schemas.microsoft.com/office/word/2010/wordprocessingShape" mc:Ignorable="w14 w15 w16se w16cid w16 w16cex w16sdtdh w16sdtfl w16du wp14">
   <w:tbl>
     <w:tblPr>
@@ -1102,6 +1098,16 @@
 </w:ftr>
 </file>
 
+<file path=word/footer3.xml><?xml version="1.0" encoding="utf-8"?>
+<w:ftr xmlns:wpc="http://schemas.microsoft.com/office/word/2010/wordprocessingCanvas" xmlns:cx="http://schemas.microsoft.com/office/drawing/2014/chartex" xmlns:cx1="http://schemas.microsoft.com/office/drawing/2015/9/8/chartex" xmlns:cx2="http://schemas.microsoft.com/office/drawing/2015/10/21/chartex" xmlns:cx3="http://schemas.microsoft.com/office/drawing/2016/5/9/chartex" xmlns:cx4="http://schemas.microsoft.com/office/drawing/2016/5/10/chartex" xmlns:cx5="http://schemas.microsoft.com/office/drawing/2016/5/11/chartex" xmlns:cx6="http://schemas.microsoft.com/office/drawing/2016/5/12/chartex" xmlns:cx7="http://schemas.microsoft.com/office/drawing/2016/5/13/chartex" xmlns:cx8="http://schemas.microsoft.com/office/drawing/2016/5/14/chartex" xmlns:mc="http://schemas.openxmlformats.org/markup-compatibility/2006" xmlns:aink="http://schemas.microsoft.com/office/drawing/2016/ink" xmlns:am3d="http://schemas.microsoft.com/office/drawing/2017/model3d" xmlns:o="urn:schemas-microsoft-com:office:office" xmlns:oel="http://schemas.microsoft.com/office/2019/extlst" xmlns:r="http://schemas.openxmlformats.org/officeDocument/2006/relationships" xmlns:m="http://schemas.openxmlformats.org/officeDocument/2006/math" xmlns:v="urn:schemas-microsoft-com:vml" xmlns:wp14="http://schemas.microsoft.com/office/word/2010/wordprocessingDrawing" xmlns:wp="http://schemas.openxmlformats.org/drawingml/2006/wordprocessingDrawing" xmlns:w10="urn:schemas-microsoft-com:office:word" xmlns:w="http://schemas.openxmlformats.org/wordprocessingml/2006/main" xmlns:w14="http://schemas.microsoft.com/office/word/2010/wordml" xmlns:w15="http://schemas.microsoft.com/office/word/2012/wordml" xmlns:w16cex="http://schemas.microsoft.com/office/word/2018/wordml/cex" xmlns:w16cid="http://schemas.microsoft.com/office/word/2016/wordml/cid" xmlns:w16="http://schemas.microsoft.com/office/word/2018/wordml" xmlns:w16du="http://schemas.microsoft.com/office/word/2023/wordml/word16du" xmlns:w16sdtdh="http://schemas.microsoft.com/office/word/2020/wordml/sdtdatahash" xmlns:w16sdtfl="http://schemas.microsoft.com/office/word/2024/wordml/sdtformatlock" xmlns:w16se="http://schemas.microsoft.com/office/word/2015/wordml/symex" xmlns:wpg="http://schemas.microsoft.com/office/word/2010/wordprocessingGroup" xmlns:wpi="http://schemas.microsoft.com/office/word/2010/wordprocessingInk" xmlns:wne="http://schemas.microsoft.com/office/word/2006/wordml" xmlns:wps="http://schemas.microsoft.com/office/word/2010/wordprocessingShape" mc:Ignorable="w14 w15 w16se w16cid w16 w16cex w16sdtdh w16sdtfl w16du wp14">
+  <w:p>
+    <w:pPr>
+      <w:pStyle w:val="Piedepgina"/>
+    </w:pPr>
+  </w:p>
+</w:ftr>
+</file>
+
 <file path=word/footnotes.xml><?xml version="1.0" encoding="utf-8"?>
 <w:footnotes xmlns:wpc="http://schemas.microsoft.com/office/word/2010/wordprocessingCanvas" xmlns:cx="http://schemas.microsoft.com/office/drawing/2014/chartex" xmlns:cx1="http://schemas.microsoft.com/office/drawing/2015/9/8/chartex" xmlns:cx2="http://schemas.microsoft.com/office/drawing/2015/10/21/chartex" xmlns:cx3="http://schemas.microsoft.com/office/drawing/2016/5/9/chartex" xmlns:cx4="http://schemas.microsoft.com/office/drawing/2016/5/10/chartex" xmlns:cx5="http://schemas.microsoft.com/office/drawing/2016/5/11/chartex" xmlns:cx6="http://schemas.microsoft.com/office/drawing/2016/5/12/chartex" xmlns:cx7="http://schemas.microsoft.com/office/drawing/2016/5/13/chartex" xmlns:cx8="http://schemas.microsoft.com/office/drawing/2016/5/14/chartex" xmlns:mc="http://schemas.openxmlformats.org/markup-compatibility/2006" xmlns:aink="http://schemas.microsoft.com/office/drawing/2016/ink" xmlns:am3d="http://schemas.microsoft.com/office/drawing/2017/model3d" xmlns:o="urn:schemas-microsoft-com:office:office" xmlns:oel="http://schemas.microsoft.com/office/2019/extlst" xmlns:r="http://schemas.openxmlformats.org/officeDocument/2006/relationships" xmlns:m="http://schemas.openxmlformats.org/officeDocument/2006/math" xmlns:v="urn:schemas-microsoft-com:vml" xmlns:wp14="http://schemas.microsoft.com/office/word/2010/wordprocessingDrawing" xmlns:wp="http://schemas.openxmlformats.org/drawingml/2006/wordprocessingDrawing" xmlns:w10="urn:schemas-microsoft-com:office:word" xmlns:w="http://schemas.openxmlformats.org/wordprocessingml/2006/main" xmlns:w14="http://schemas.microsoft.com/office/word/2010/wordml" xmlns:w15="http://schemas.microsoft.com/office/word/2012/wordml" xmlns:w16cex="http://schemas.microsoft.com/office/word/2018/wordml/cex" xmlns:w16cid="http://schemas.microsoft.com/office/word/2016/wordml/cid" xmlns:w16="http://schemas.microsoft.com/office/word/2018/wordml" xmlns:w16du="http://schemas.microsoft.com/office/word/2023/wordml/word16du" xmlns:w16sdtdh="http://schemas.microsoft.com/office/word/2020/wordml/sdtdatahash" xmlns:w16sdtfl="http://schemas.microsoft.com/office/word/2024/wordml/sdtformatlock" xmlns:w16se="http://schemas.microsoft.com/office/word/2015/wordml/symex" xmlns:wpg="http://schemas.microsoft.com/office/word/2010/wordprocessingGroup" xmlns:wpi="http://schemas.microsoft.com/office/word/2010/wordprocessingInk" xmlns:wne="http://schemas.microsoft.com/office/word/2006/wordml" xmlns:wps="http://schemas.microsoft.com/office/word/2010/wordprocessingShape" mc:Ignorable="w14 w15 w16se w16cid w16 w16cex w16sdtdh w16sdtfl w16du wp14">
   <w:footnote w:type="separator" w:id="-1">
@@ -1130,15 +1136,25 @@
 <file path=word/header1.xml><?xml version="1.0" encoding="utf-8"?>
 <w:hdr xmlns:wpc="http://schemas.microsoft.com/office/word/2010/wordprocessingCanvas" xmlns:cx="http://schemas.microsoft.com/office/drawing/2014/chartex" xmlns:cx1="http://schemas.microsoft.com/office/drawing/2015/9/8/chartex" xmlns:cx2="http://schemas.microsoft.com/office/drawing/2015/10/21/chartex" xmlns:cx3="http://schemas.microsoft.com/office/drawing/2016/5/9/chartex" xmlns:cx4="http://schemas.microsoft.com/office/drawing/2016/5/10/chartex" xmlns:cx5="http://schemas.microsoft.com/office/drawing/2016/5/11/chartex" xmlns:cx6="http://schemas.microsoft.com/office/drawing/2016/5/12/chartex" xmlns:cx7="http://schemas.microsoft.com/office/drawing/2016/5/13/chartex" xmlns:cx8="http://schemas.microsoft.com/office/drawing/2016/5/14/chartex" xmlns:mc="http://schemas.openxmlformats.org/markup-compatibility/2006" xmlns:aink="http://schemas.microsoft.com/office/drawing/2016/ink" xmlns:am3d="http://schemas.microsoft.com/office/drawing/2017/model3d" xmlns:o="urn:schemas-microsoft-com:office:office" xmlns:oel="http://schemas.microsoft.com/office/2019/extlst" xmlns:r="http://schemas.openxmlformats.org/officeDocument/2006/relationships" xmlns:m="http://schemas.openxmlformats.org/officeDocument/2006/math" xmlns:v="urn:schemas-microsoft-com:vml" xmlns:wp14="http://schemas.microsoft.com/office/word/2010/wordprocessingDrawing" xmlns:wp="http://schemas.openxmlformats.org/drawingml/2006/wordprocessingDrawing" xmlns:w10="urn:schemas-microsoft-com:office:word" xmlns:w="http://schemas.openxmlformats.org/wordprocessingml/2006/main" xmlns:w14="http://schemas.microsoft.com/office/word/2010/wordml" xmlns:w15="http://schemas.microsoft.com/office/word/2012/wordml" xmlns:w16cex="http://schemas.microsoft.com/office/word/2018/wordml/cex" xmlns:w16cid="http://schemas.microsoft.com/office/word/2016/wordml/cid" xmlns:w16="http://schemas.microsoft.com/office/word/2018/wordml" xmlns:w16du="http://schemas.microsoft.com/office/word/2023/wordml/word16du" xmlns:w16sdtdh="http://schemas.microsoft.com/office/word/2020/wordml/sdtdatahash" xmlns:w16sdtfl="http://schemas.microsoft.com/office/word/2024/wordml/sdtformatlock" xmlns:w16se="http://schemas.microsoft.com/office/word/2015/wordml/symex" xmlns:wpg="http://schemas.microsoft.com/office/word/2010/wordprocessingGroup" xmlns:wpi="http://schemas.microsoft.com/office/word/2010/wordprocessingInk" xmlns:wne="http://schemas.microsoft.com/office/word/2006/wordml" xmlns:wps="http://schemas.microsoft.com/office/word/2010/wordprocessingShape" mc:Ignorable="w14 w15 w16se w16cid w16 w16cex w16sdtdh w16sdtfl w16du wp14">
   <w:p>
+    <w:pPr>
+      <w:pStyle w:val="Encabezado"/>
+    </w:pPr>
+  </w:p>
+</w:hdr>
+</file>
+
+<file path=word/header2.xml><?xml version="1.0" encoding="utf-8"?>
+<w:hdr xmlns:wpc="http://schemas.microsoft.com/office/word/2010/wordprocessingCanvas" xmlns:cx="http://schemas.microsoft.com/office/drawing/2014/chartex" xmlns:cx1="http://schemas.microsoft.com/office/drawing/2015/9/8/chartex" xmlns:cx2="http://schemas.microsoft.com/office/drawing/2015/10/21/chartex" xmlns:cx3="http://schemas.microsoft.com/office/drawing/2016/5/9/chartex" xmlns:cx4="http://schemas.microsoft.com/office/drawing/2016/5/10/chartex" xmlns:cx5="http://schemas.microsoft.com/office/drawing/2016/5/11/chartex" xmlns:cx6="http://schemas.microsoft.com/office/drawing/2016/5/12/chartex" xmlns:cx7="http://schemas.microsoft.com/office/drawing/2016/5/13/chartex" xmlns:cx8="http://schemas.microsoft.com/office/drawing/2016/5/14/chartex" xmlns:mc="http://schemas.openxmlformats.org/markup-compatibility/2006" xmlns:aink="http://schemas.microsoft.com/office/drawing/2016/ink" xmlns:am3d="http://schemas.microsoft.com/office/drawing/2017/model3d" xmlns:o="urn:schemas-microsoft-com:office:office" xmlns:oel="http://schemas.microsoft.com/office/2019/extlst" xmlns:r="http://schemas.openxmlformats.org/officeDocument/2006/relationships" xmlns:m="http://schemas.openxmlformats.org/officeDocument/2006/math" xmlns:v="urn:schemas-microsoft-com:vml" xmlns:wp14="http://schemas.microsoft.com/office/word/2010/wordprocessingDrawing" xmlns:wp="http://schemas.openxmlformats.org/drawingml/2006/wordprocessingDrawing" xmlns:w10="urn:schemas-microsoft-com:office:word" xmlns:w="http://schemas.openxmlformats.org/wordprocessingml/2006/main" xmlns:w14="http://schemas.microsoft.com/office/word/2010/wordml" xmlns:w15="http://schemas.microsoft.com/office/word/2012/wordml" xmlns:w16cex="http://schemas.microsoft.com/office/word/2018/wordml/cex" xmlns:w16cid="http://schemas.microsoft.com/office/word/2016/wordml/cid" xmlns:w16="http://schemas.microsoft.com/office/word/2018/wordml" xmlns:w16du="http://schemas.microsoft.com/office/word/2023/wordml/word16du" xmlns:w16sdtdh="http://schemas.microsoft.com/office/word/2020/wordml/sdtdatahash" xmlns:w16sdtfl="http://schemas.microsoft.com/office/word/2024/wordml/sdtformatlock" xmlns:w16se="http://schemas.microsoft.com/office/word/2015/wordml/symex" xmlns:wpg="http://schemas.microsoft.com/office/word/2010/wordprocessingGroup" xmlns:wpi="http://schemas.microsoft.com/office/word/2010/wordprocessingInk" xmlns:wne="http://schemas.microsoft.com/office/word/2006/wordml" xmlns:wps="http://schemas.microsoft.com/office/word/2010/wordprocessingShape" mc:Ignorable="w14 w15 w16se w16cid w16 w16cex w16sdtdh w16sdtfl w16du wp14">
+  <w:p>
     <w:r>
       <w:rPr>
         <w:noProof/>
       </w:rPr>
       <w:drawing>
-        <wp:inline distT="0" distB="0" distL="0" distR="0" wp14:anchorId="068A6F70" wp14:editId="281C6BA8">
-          <wp:extent cx="5710238" cy="896316"/>
+        <wp:inline distT="0" distB="0" distL="0" distR="0" wp14:anchorId="5FB72D7B" wp14:editId="0B2D687A">
+          <wp:extent cx="5724525" cy="819150"/>
           <wp:effectExtent l="0" t="0" r="0" b="0"/>
-          <wp:docPr id="1801904356" name="Imagen 1801904356" descr="Imagen"/>
+          <wp:docPr id="1644545599" name="Imagen 1"/>
           <wp:cNvGraphicFramePr>
             <a:graphicFrameLocks xmlns:a="http://schemas.openxmlformats.org/drawingml/2006/main" noChangeAspect="1"/>
           </wp:cNvGraphicFramePr>
@@ -1146,8 +1162,10 @@
             <a:graphicData uri="http://schemas.openxmlformats.org/drawingml/2006/picture">
               <pic:pic xmlns:pic="http://schemas.openxmlformats.org/drawingml/2006/picture">
                 <pic:nvPicPr>
-                  <pic:cNvPr id="0" name=""/>
-                  <pic:cNvPicPr/>
+                  <pic:cNvPr id="0" name="Picture 1"/>
+                  <pic:cNvPicPr>
+                    <a:picLocks noChangeAspect="1" noChangeArrowheads="1"/>
+                  </pic:cNvPicPr>
                 </pic:nvPicPr>
                 <pic:blipFill>
                   <a:blip r:embed="rId1">
@@ -1157,18 +1175,23 @@
                       </a:ext>
                     </a:extLst>
                   </a:blip>
+                  <a:srcRect/>
                   <a:stretch>
                     <a:fillRect/>
                   </a:stretch>
                 </pic:blipFill>
-                <pic:spPr>
+                <pic:spPr bwMode="auto">
                   <a:xfrm>
                     <a:off x="0" y="0"/>
-                    <a:ext cx="5710238" cy="896316"/>
+                    <a:ext cx="5724525" cy="819150"/>
                   </a:xfrm>
                   <a:prstGeom prst="rect">
                     <a:avLst/>
                   </a:prstGeom>
+                  <a:noFill/>
+                  <a:ln>
+                    <a:noFill/>
+                  </a:ln>
                 </pic:spPr>
               </pic:pic>
             </a:graphicData>
@@ -1176,6 +1199,16 @@
         </wp:inline>
       </w:drawing>
     </w:r>
+  </w:p>
+</w:hdr>
+</file>
+
+<file path=word/header3.xml><?xml version="1.0" encoding="utf-8"?>
+<w:hdr xmlns:wpc="http://schemas.microsoft.com/office/word/2010/wordprocessingCanvas" xmlns:cx="http://schemas.microsoft.com/office/drawing/2014/chartex" xmlns:cx1="http://schemas.microsoft.com/office/drawing/2015/9/8/chartex" xmlns:cx2="http://schemas.microsoft.com/office/drawing/2015/10/21/chartex" xmlns:cx3="http://schemas.microsoft.com/office/drawing/2016/5/9/chartex" xmlns:cx4="http://schemas.microsoft.com/office/drawing/2016/5/10/chartex" xmlns:cx5="http://schemas.microsoft.com/office/drawing/2016/5/11/chartex" xmlns:cx6="http://schemas.microsoft.com/office/drawing/2016/5/12/chartex" xmlns:cx7="http://schemas.microsoft.com/office/drawing/2016/5/13/chartex" xmlns:cx8="http://schemas.microsoft.com/office/drawing/2016/5/14/chartex" xmlns:mc="http://schemas.openxmlformats.org/markup-compatibility/2006" xmlns:aink="http://schemas.microsoft.com/office/drawing/2016/ink" xmlns:am3d="http://schemas.microsoft.com/office/drawing/2017/model3d" xmlns:o="urn:schemas-microsoft-com:office:office" xmlns:oel="http://schemas.microsoft.com/office/2019/extlst" xmlns:r="http://schemas.openxmlformats.org/officeDocument/2006/relationships" xmlns:m="http://schemas.openxmlformats.org/officeDocument/2006/math" xmlns:v="urn:schemas-microsoft-com:vml" xmlns:wp14="http://schemas.microsoft.com/office/word/2010/wordprocessingDrawing" xmlns:wp="http://schemas.openxmlformats.org/drawingml/2006/wordprocessingDrawing" xmlns:w10="urn:schemas-microsoft-com:office:word" xmlns:w="http://schemas.openxmlformats.org/wordprocessingml/2006/main" xmlns:w14="http://schemas.microsoft.com/office/word/2010/wordml" xmlns:w15="http://schemas.microsoft.com/office/word/2012/wordml" xmlns:w16cex="http://schemas.microsoft.com/office/word/2018/wordml/cex" xmlns:w16cid="http://schemas.microsoft.com/office/word/2016/wordml/cid" xmlns:w16="http://schemas.microsoft.com/office/word/2018/wordml" xmlns:w16du="http://schemas.microsoft.com/office/word/2023/wordml/word16du" xmlns:w16sdtdh="http://schemas.microsoft.com/office/word/2020/wordml/sdtdatahash" xmlns:w16sdtfl="http://schemas.microsoft.com/office/word/2024/wordml/sdtformatlock" xmlns:w16se="http://schemas.microsoft.com/office/word/2015/wordml/symex" xmlns:wpg="http://schemas.microsoft.com/office/word/2010/wordprocessingGroup" xmlns:wpi="http://schemas.microsoft.com/office/word/2010/wordprocessingInk" xmlns:wne="http://schemas.microsoft.com/office/word/2006/wordml" xmlns:wps="http://schemas.microsoft.com/office/word/2010/wordprocessingShape" mc:Ignorable="w14 w15 w16se w16cid w16 w16cex w16sdtdh w16sdtfl w16du wp14">
+  <w:p>
+    <w:pPr>
+      <w:pStyle w:val="Encabezado"/>
+    </w:pPr>
   </w:p>
 </w:hdr>
 </file>

</xml_diff>